<commit_message>
release(v3): phat hanh ban v4.3.79 - Velzon Migration
</commit_message>
<xml_diff>
--- a/template_bao_cao_V2_fixed.docx
+++ b/template_bao_cao_V2_fixed.docx
@@ -116,28 +116,7 @@
                 <w:szCs w:val="28"/>
               </w:rPr>
               <w:br/>
-            </w:r>
-            <w:proofErr w:type="spellStart"/>
-            <w:r>
-              <w:rPr>
-                <w:rFonts w:ascii="Times New Roman" w:eastAsia="Times New Roman" w:hAnsi="Times New Roman" w:cs="Times New Roman"/>
-                <w:b/>
-                <w:color w:val="000000" w:themeColor="text1"/>
-                <w:sz w:val="28"/>
-                <w:szCs w:val="28"/>
-              </w:rPr>
-              <w:t>Độc</w:t>
-            </w:r>
-            <w:proofErr w:type="spellEnd"/>
-            <w:r>
-              <w:rPr>
-                <w:rFonts w:ascii="Times New Roman" w:eastAsia="Times New Roman" w:hAnsi="Times New Roman" w:cs="Times New Roman"/>
-                <w:b/>
-                <w:color w:val="000000" w:themeColor="text1"/>
-                <w:sz w:val="28"/>
-                <w:szCs w:val="28"/>
-              </w:rPr>
-              <w:t xml:space="preserve"> </w:t>
+              <w:t xml:space="preserve">Độc </w:t>
             </w:r>
             <w:proofErr w:type="spellStart"/>
             <w:r>
@@ -1372,16 +1351,7 @@
           <w:sz w:val="28"/>
           <w:szCs w:val="28"/>
         </w:rPr>
-        <w:t>}</w:t>
-      </w:r>
-      <w:r>
-        <w:rPr>
-          <w:rFonts w:ascii="Times New Roman" w:hAnsi="Times New Roman" w:cs="Times New Roman"/>
-          <w:color w:val="000000" w:themeColor="text1"/>
-          <w:sz w:val="28"/>
-          <w:szCs w:val="28"/>
-        </w:rPr>
-        <w:t>.</w:t>
+        <w:t>}.</w:t>
       </w:r>
     </w:p>
     <w:p>
@@ -1503,16 +1473,7 @@
           <w:sz w:val="28"/>
           <w:szCs w:val="28"/>
         </w:rPr>
-        <w:t>}</w:t>
-      </w:r>
-      <w:r>
-        <w:rPr>
-          <w:rFonts w:ascii="Times New Roman" w:hAnsi="Times New Roman" w:cs="Times New Roman"/>
-          <w:color w:val="000000" w:themeColor="text1"/>
-          <w:sz w:val="28"/>
-          <w:szCs w:val="28"/>
-        </w:rPr>
-        <w:t xml:space="preserve"> </w:t>
+        <w:t xml:space="preserve">} </w:t>
       </w:r>
       <w:proofErr w:type="spellStart"/>
       <w:r>
@@ -2194,6 +2155,7 @@
           </w:tcPr>
           <w:p>
             <w:pPr>
+              <w:jc w:val="center"/>
               <w:rPr>
                 <w:rFonts w:ascii="Times New Roman" w:hAnsi="Times New Roman" w:cs="Times New Roman"/>
                 <w:color w:val="000000" w:themeColor="text1"/>
@@ -2219,6 +2181,7 @@
           </w:tcPr>
           <w:p>
             <w:pPr>
+              <w:jc w:val="center"/>
               <w:rPr>
                 <w:rFonts w:ascii="Times New Roman" w:hAnsi="Times New Roman" w:cs="Times New Roman"/>
                 <w:color w:val="000000" w:themeColor="text1"/>
@@ -2244,6 +2207,7 @@
           </w:tcPr>
           <w:p>
             <w:pPr>
+              <w:jc w:val="center"/>
               <w:rPr>
                 <w:rFonts w:ascii="Times New Roman" w:hAnsi="Times New Roman" w:cs="Times New Roman"/>
                 <w:color w:val="000000" w:themeColor="text1"/>
@@ -2269,6 +2233,7 @@
           </w:tcPr>
           <w:p>
             <w:pPr>
+              <w:jc w:val="center"/>
               <w:rPr>
                 <w:rFonts w:ascii="Times New Roman" w:hAnsi="Times New Roman" w:cs="Times New Roman"/>
                 <w:color w:val="000000" w:themeColor="text1"/>
@@ -2349,7 +2314,17 @@
                 <w:sz w:val="28"/>
                 <w:szCs w:val="28"/>
               </w:rPr>
-              <w:t>{{ d</w:t>
+              <w:t xml:space="preserve">{{ </w:t>
+            </w:r>
+            <w:proofErr w:type="spellStart"/>
+            <w:r>
+              <w:rPr>
+                <w:rFonts w:ascii="Times New Roman" w:hAnsi="Times New Roman" w:cs="Times New Roman"/>
+                <w:color w:val="000000" w:themeColor="text1"/>
+                <w:sz w:val="28"/>
+                <w:szCs w:val="28"/>
+              </w:rPr>
+              <w:t>d</w:t>
             </w:r>
             <w:proofErr w:type="gramEnd"/>
             <w:r>
@@ -2359,7 +2334,17 @@
                 <w:sz w:val="28"/>
                 <w:szCs w:val="28"/>
               </w:rPr>
-              <w:t>.node_label }}</w:t>
+              <w:t>.node_label</w:t>
+            </w:r>
+            <w:proofErr w:type="spellEnd"/>
+            <w:r>
+              <w:rPr>
+                <w:rFonts w:ascii="Times New Roman" w:hAnsi="Times New Roman" w:cs="Times New Roman"/>
+                <w:color w:val="000000" w:themeColor="text1"/>
+                <w:sz w:val="28"/>
+                <w:szCs w:val="28"/>
+              </w:rPr>
+              <w:t xml:space="preserve"> }}</w:t>
             </w:r>
             <w:r>
               <w:rPr>

</xml_diff>